<commit_message>
Fix italics (and Greek/Hebrew fonts) lost in footnotes
The Footnote style's settings written on each note run for Affinity included its FontStyle
and font, which as local settings overrode the run's character style. Settings the
character style sets are now left off the run. The sample book's notes have italics and Greek.

Co-Authored-By: Claude Opus 5.5 <noreply@anthropic.com>
Claude-Session: https://claude.ai/code/session_0191wvpjpaNQEoyubBdy918Q
</commit_message>
<xml_diff>
--- a/reference/manuscript/01 Chapter One.docx
+++ b/reference/manuscript/01 Chapter One.docx
@@ -403,7 +403,16 @@
         <w:pStyle w:val="FootnoteText"/>
       </w:pPr>
       <w:r>
-        <w:t xml:space="preserve">See the commentary on Leviticus for the priestly setting.</w:t>
+        <w:t xml:space="preserve">See the commentary on Leviticus in </w:t>
+      </w:r>
+      <w:r>
+        <w:rPr>
+          <w:i/>
+        </w:rPr>
+        <w:t xml:space="preserve">The Anchor Bible</w:t>
+      </w:r>
+      <w:r>
+        <w:t xml:space="preserve"> for the priestly setting.</w:t>
       </w:r>
     </w:p>
   </w:footnote>
@@ -413,7 +422,22 @@
         <w:pStyle w:val="FootnoteText"/>
       </w:pPr>
       <w:r>
-        <w:t xml:space="preserve">On the Greek of John's prologue, see the standard grammars.</w:t>
+        <w:t xml:space="preserve">On the Greek of John's prologue (</w:t>
+      </w:r>
+      <w:r>
+        <w:t xml:space="preserve">Ἐν ἀρχῇ ἦν ὁ λόγος, </w:t>
+      </w:r>
+      <w:r>
+        <w:t xml:space="preserve">), see </w:t>
+      </w:r>
+      <w:r>
+        <w:rPr>
+          <w:i/>
+        </w:rPr>
+        <w:t xml:space="preserve">A Grammar of New Testament Greek</w:t>
+      </w:r>
+      <w:r>
+        <w:t xml:space="preserve">.</w:t>
       </w:r>
     </w:p>
   </w:footnote>

</xml_diff>